<commit_message>
Updates to HR system
</commit_message>
<xml_diff>
--- a/public/JOB DESCRIPTION - الوصف الوضيفي - .docx
+++ b/public/JOB DESCRIPTION - الوصف الوضيفي - .docx
@@ -55,7 +55,7 @@
           <w:p>
             <w:r>
               <w:rPr>
-                <w:rFonts w:cs="Montserrat"/>
+                <w:rFonts w:cs="Readex Pro Light"/>
                 <w:color w:val="000000"/>
               </w:rPr>
               <w:t xml:space="preserve">Document Reference </w:t>
@@ -63,7 +63,7 @@
             <w:proofErr w:type="gramStart"/>
             <w:r>
               <w:rPr>
-                <w:rFonts w:cs="Montserrat"/>
+                <w:rFonts w:cs="Readex Pro Light"/>
                 <w:color w:val="000000"/>
               </w:rPr>
               <w:t>No::</w:t>
@@ -133,7 +133,7 @@
             </w:pPr>
             <w:r>
               <w:rPr>
-                <w:rFonts w:ascii="Noto Kufi Arabic" w:hAnsi="Noto Kufi Arabic"/>
+                <w:rFonts w:ascii="Montserrat" w:hAnsi="Montserrat"/>
                 <w:color w:val="000000"/>
                 <w:rtl/>
               </w:rPr>
@@ -170,7 +170,7 @@
           <w:p>
             <w:r>
               <w:rPr>
-                <w:rFonts w:cs="Montserrat"/>
+                <w:rFonts w:cs="Readex Pro Light"/>
                 <w:b/>
                 <w:bCs/>
                 <w:color w:val="FFFFFF"/>
@@ -181,7 +181,7 @@
             </w:r>
             <w:r>
               <w:rPr>
-                <w:rFonts w:cs="Montserrat"/>
+                <w:rFonts w:cs="Readex Pro Light"/>
                 <w:b/>
                 <w:bCs/>
                 <w:color w:val="FFFFFF"/>
@@ -217,7 +217,7 @@
             </w:pPr>
             <w:r>
               <w:rPr>
-                <w:rFonts w:ascii="Noto Kufi Arabic" w:hAnsi="Noto Kufi Arabic"/>
+                <w:rFonts w:ascii="Montserrat" w:hAnsi="Montserrat"/>
                 <w:b/>
                 <w:bCs/>
                 <w:color w:val="FFFFFF"/>
@@ -229,7 +229,7 @@
             </w:r>
             <w:r>
               <w:rPr>
-                <w:rFonts w:ascii="Noto Kufi Arabic" w:hAnsi="Noto Kufi Arabic"/>
+                <w:rFonts w:ascii="Montserrat" w:hAnsi="Montserrat"/>
                 <w:b/>
                 <w:bCs/>
                 <w:color w:val="FFFFFF"/>
@@ -268,7 +268,7 @@
           <w:p>
             <w:r>
               <w:rPr>
-                <w:rFonts w:cs="Montserrat"/>
+                <w:rFonts w:cs="Readex Pro Light"/>
                 <w:color w:val="000000"/>
               </w:rPr>
               <w:t>Position Title:</w:t>
@@ -318,7 +318,7 @@
             </w:pPr>
             <w:r>
               <w:rPr>
-                <w:rFonts w:ascii="Noto Kufi Arabic" w:hAnsi="Noto Kufi Arabic"/>
+                <w:rFonts w:ascii="Montserrat" w:hAnsi="Montserrat"/>
                 <w:color w:val="000000"/>
                 <w:rtl/>
               </w:rPr>
@@ -353,7 +353,7 @@
           <w:p>
             <w:r>
               <w:rPr>
-                <w:rFonts w:cs="Montserrat"/>
+                <w:rFonts w:cs="Readex Pro Light"/>
                 <w:color w:val="000000"/>
               </w:rPr>
               <w:t>No. of Positions Required:</w:t>
@@ -403,7 +403,7 @@
             </w:pPr>
             <w:r>
               <w:rPr>
-                <w:rFonts w:ascii="Noto Kufi Arabic" w:hAnsi="Noto Kufi Arabic"/>
+                <w:rFonts w:ascii="Montserrat" w:hAnsi="Montserrat"/>
                 <w:color w:val="000000"/>
                 <w:rtl/>
               </w:rPr>
@@ -438,7 +438,7 @@
           <w:p>
             <w:r>
               <w:rPr>
-                <w:rFonts w:cs="Montserrat"/>
+                <w:rFonts w:cs="Readex Pro Light"/>
                 <w:color w:val="000000"/>
               </w:rPr>
               <w:t>Division</w:t>
@@ -488,7 +488,7 @@
             </w:pPr>
             <w:r>
               <w:rPr>
-                <w:rFonts w:ascii="Noto Kufi Arabic" w:hAnsi="Noto Kufi Arabic"/>
+                <w:rFonts w:ascii="Montserrat" w:hAnsi="Montserrat"/>
                 <w:color w:val="000000"/>
                 <w:rtl/>
               </w:rPr>
@@ -523,7 +523,7 @@
           <w:p>
             <w:r>
               <w:rPr>
-                <w:rFonts w:cs="Montserrat"/>
+                <w:rFonts w:cs="Readex Pro Light"/>
                 <w:color w:val="000000"/>
               </w:rPr>
               <w:t>Department</w:t>
@@ -573,7 +573,7 @@
             </w:pPr>
             <w:r>
               <w:rPr>
-                <w:rFonts w:ascii="Noto Kufi Arabic" w:hAnsi="Noto Kufi Arabic"/>
+                <w:rFonts w:ascii="Montserrat" w:hAnsi="Montserrat"/>
                 <w:color w:val="000000"/>
                 <w:rtl/>
               </w:rPr>
@@ -608,7 +608,7 @@
           <w:p>
             <w:r>
               <w:rPr>
-                <w:rFonts w:cs="Montserrat"/>
+                <w:rFonts w:cs="Readex Pro Light"/>
                 <w:color w:val="000000"/>
               </w:rPr>
               <w:t>Reports To:</w:t>
@@ -658,7 +658,7 @@
             </w:pPr>
             <w:r>
               <w:rPr>
-                <w:rFonts w:ascii="Noto Kufi Arabic" w:hAnsi="Noto Kufi Arabic"/>
+                <w:rFonts w:ascii="Montserrat" w:hAnsi="Montserrat"/>
                 <w:color w:val="000000"/>
                 <w:rtl/>
               </w:rPr>
@@ -693,7 +693,7 @@
           <w:p>
             <w:r>
               <w:rPr>
-                <w:rFonts w:cs="Montserrat"/>
+                <w:rFonts w:cs="Readex Pro Light"/>
                 <w:color w:val="000000"/>
               </w:rPr>
               <w:t>Place of Work:</w:t>
@@ -743,7 +743,7 @@
             </w:pPr>
             <w:r>
               <w:rPr>
-                <w:rFonts w:ascii="Noto Kufi Arabic" w:hAnsi="Noto Kufi Arabic"/>
+                <w:rFonts w:ascii="Montserrat" w:hAnsi="Montserrat"/>
                 <w:color w:val="000000"/>
                 <w:rtl/>
               </w:rPr>
@@ -780,7 +780,7 @@
           <w:p>
             <w:r>
               <w:rPr>
-                <w:rFonts w:cs="Montserrat"/>
+                <w:rFonts w:cs="Readex Pro Light"/>
                 <w:b/>
                 <w:bCs/>
                 <w:color w:val="FFFFFF"/>
@@ -791,7 +791,7 @@
             </w:r>
             <w:r>
               <w:rPr>
-                <w:rFonts w:cs="Montserrat"/>
+                <w:rFonts w:cs="Readex Pro Light"/>
                 <w:b/>
                 <w:bCs/>
                 <w:color w:val="FFFFFF"/>
@@ -827,7 +827,7 @@
             </w:pPr>
             <w:r>
               <w:rPr>
-                <w:rFonts w:ascii="Noto Kufi Arabic" w:hAnsi="Noto Kufi Arabic"/>
+                <w:rFonts w:ascii="Montserrat" w:hAnsi="Montserrat"/>
                 <w:b/>
                 <w:bCs/>
                 <w:color w:val="FFFFFF"/>
@@ -839,7 +839,7 @@
             </w:r>
             <w:r>
               <w:rPr>
-                <w:rFonts w:ascii="Noto Kufi Arabic" w:hAnsi="Noto Kufi Arabic"/>
+                <w:rFonts w:ascii="Montserrat" w:hAnsi="Montserrat"/>
                 <w:b/>
                 <w:bCs/>
                 <w:color w:val="FFFFFF"/>
@@ -878,7 +878,7 @@
           <w:p>
             <w:r>
               <w:rPr>
-                <w:rFonts w:cs="Montserrat"/>
+                <w:rFonts w:cs="Readex Pro Light"/>
                 <w:color w:val="000000"/>
               </w:rPr>
               <w:t>Job Purpose</w:t>
@@ -928,7 +928,7 @@
             </w:pPr>
             <w:r>
               <w:rPr>
-                <w:rFonts w:ascii="Noto Kufi Arabic" w:hAnsi="Noto Kufi Arabic"/>
+                <w:rFonts w:ascii="Montserrat" w:hAnsi="Montserrat"/>
                 <w:color w:val="000000"/>
                 <w:rtl/>
               </w:rPr>
@@ -963,7 +963,7 @@
           <w:p>
             <w:r>
               <w:rPr>
-                <w:rFonts w:cs="Montserrat"/>
+                <w:rFonts w:cs="Readex Pro Light"/>
                 <w:color w:val="000000"/>
               </w:rPr>
               <w:t>Key Responsibilities</w:t>
@@ -1013,7 +1013,7 @@
             </w:pPr>
             <w:r>
               <w:rPr>
-                <w:rFonts w:ascii="Noto Kufi Arabic" w:hAnsi="Noto Kufi Arabic"/>
+                <w:rFonts w:ascii="Montserrat" w:hAnsi="Montserrat"/>
                 <w:color w:val="000000"/>
                 <w:rtl/>
               </w:rPr>
@@ -1048,7 +1048,7 @@
           <w:p>
             <w:r>
               <w:rPr>
-                <w:rFonts w:cs="Montserrat"/>
+                <w:rFonts w:cs="Readex Pro Light"/>
                 <w:color w:val="000000"/>
               </w:rPr>
               <w:t>Key Performance Indicator</w:t>
@@ -1098,7 +1098,7 @@
             </w:pPr>
             <w:r>
               <w:rPr>
-                <w:rFonts w:ascii="Noto Kufi Arabic" w:hAnsi="Noto Kufi Arabic"/>
+                <w:rFonts w:ascii="Montserrat" w:hAnsi="Montserrat"/>
                 <w:color w:val="000000"/>
                 <w:rtl/>
               </w:rPr>
@@ -1135,7 +1135,7 @@
           <w:p>
             <w:r>
               <w:rPr>
-                <w:rFonts w:cs="Montserrat"/>
+                <w:rFonts w:cs="Readex Pro Light"/>
                 <w:b/>
                 <w:bCs/>
                 <w:color w:val="FFFFFF"/>
@@ -1146,7 +1146,7 @@
             </w:r>
             <w:r>
               <w:rPr>
-                <w:rFonts w:cs="Montserrat"/>
+                <w:rFonts w:cs="Readex Pro Light"/>
                 <w:b/>
                 <w:bCs/>
                 <w:color w:val="FFFFFF"/>
@@ -1182,7 +1182,7 @@
             </w:pPr>
             <w:r>
               <w:rPr>
-                <w:rFonts w:ascii="Noto Kufi Arabic" w:hAnsi="Noto Kufi Arabic"/>
+                <w:rFonts w:ascii="Montserrat" w:hAnsi="Montserrat"/>
                 <w:b/>
                 <w:bCs/>
                 <w:color w:val="FFFFFF"/>
@@ -1194,7 +1194,7 @@
             </w:r>
             <w:r>
               <w:rPr>
-                <w:rFonts w:ascii="Noto Kufi Arabic" w:hAnsi="Noto Kufi Arabic"/>
+                <w:rFonts w:ascii="Montserrat" w:hAnsi="Montserrat"/>
                 <w:b/>
                 <w:bCs/>
                 <w:color w:val="FFFFFF"/>
@@ -1233,7 +1233,7 @@
           <w:p>
             <w:r>
               <w:rPr>
-                <w:rFonts w:cs="Montserrat"/>
+                <w:rFonts w:cs="Readex Pro Light"/>
                 <w:color w:val="000000"/>
               </w:rPr>
               <w:t xml:space="preserve">Educational Background        </w:t>
@@ -1283,7 +1283,7 @@
             </w:pPr>
             <w:r>
               <w:rPr>
-                <w:rFonts w:ascii="Noto Kufi Arabic" w:hAnsi="Noto Kufi Arabic"/>
+                <w:rFonts w:ascii="Montserrat" w:hAnsi="Montserrat"/>
                 <w:color w:val="000000"/>
                 <w:rtl/>
               </w:rPr>
@@ -1318,7 +1318,7 @@
           <w:p>
             <w:r>
               <w:rPr>
-                <w:rFonts w:cs="Montserrat"/>
+                <w:rFonts w:cs="Readex Pro Light"/>
                 <w:color w:val="000000"/>
               </w:rPr>
               <w:t>Experience Required</w:t>
@@ -1368,7 +1368,7 @@
             </w:pPr>
             <w:r>
               <w:rPr>
-                <w:rFonts w:ascii="Noto Kufi Arabic" w:hAnsi="Noto Kufi Arabic"/>
+                <w:rFonts w:ascii="Montserrat" w:hAnsi="Montserrat"/>
                 <w:color w:val="000000"/>
                 <w:rtl/>
               </w:rPr>
@@ -1403,7 +1403,7 @@
           <w:p>
             <w:r>
               <w:rPr>
-                <w:rFonts w:cs="Montserrat"/>
+                <w:rFonts w:cs="Readex Pro Light"/>
                 <w:color w:val="000000"/>
               </w:rPr>
               <w:t>Skills and Competencies</w:t>
@@ -1453,7 +1453,7 @@
             </w:pPr>
             <w:r>
               <w:rPr>
-                <w:rFonts w:ascii="Noto Kufi Arabic" w:hAnsi="Noto Kufi Arabic"/>
+                <w:rFonts w:ascii="Montserrat" w:hAnsi="Montserrat"/>
                 <w:color w:val="000000"/>
                 <w:rtl/>
               </w:rPr>
@@ -1488,7 +1488,7 @@
           <w:p>
             <w:r>
               <w:rPr>
-                <w:rFonts w:cs="Montserrat"/>
+                <w:rFonts w:cs="Readex Pro Light"/>
                 <w:color w:val="000000"/>
               </w:rPr>
               <w:t>Required Trainings  and Licenses</w:t>
@@ -1538,7 +1538,7 @@
             </w:pPr>
             <w:r>
               <w:rPr>
-                <w:rFonts w:ascii="Noto Kufi Arabic" w:hAnsi="Noto Kufi Arabic"/>
+                <w:rFonts w:ascii="Montserrat" w:hAnsi="Montserrat"/>
                 <w:color w:val="000000"/>
                 <w:rtl/>
               </w:rPr>
@@ -1573,7 +1573,7 @@
           <w:p>
             <w:r>
               <w:rPr>
-                <w:rFonts w:cs="Montserrat"/>
+                <w:rFonts w:cs="Readex Pro Light"/>
                 <w:color w:val="000000"/>
               </w:rPr>
               <w:t>Working Conditions  and Risk Exposure</w:t>
@@ -1623,7 +1623,7 @@
             </w:pPr>
             <w:r>
               <w:rPr>
-                <w:rFonts w:ascii="Noto Kufi Arabic" w:hAnsi="Noto Kufi Arabic"/>
+                <w:rFonts w:ascii="Montserrat" w:hAnsi="Montserrat"/>
                 <w:color w:val="000000"/>
                 <w:rtl/>
               </w:rPr>
@@ -1660,7 +1660,7 @@
           <w:p>
             <w:r>
               <w:rPr>
-                <w:rFonts w:cs="Montserrat"/>
+                <w:rFonts w:cs="Readex Pro Light"/>
                 <w:b/>
                 <w:bCs/>
                 <w:color w:val="FFFFFF"/>
@@ -1671,7 +1671,7 @@
             </w:r>
             <w:r>
               <w:rPr>
-                <w:rFonts w:cs="Montserrat"/>
+                <w:rFonts w:cs="Readex Pro Light"/>
                 <w:b/>
                 <w:bCs/>
                 <w:color w:val="FFFFFF"/>
@@ -1707,7 +1707,7 @@
             </w:pPr>
             <w:r>
               <w:rPr>
-                <w:rFonts w:ascii="Noto Kufi Arabic" w:hAnsi="Noto Kufi Arabic"/>
+                <w:rFonts w:ascii="Montserrat" w:hAnsi="Montserrat"/>
                 <w:b/>
                 <w:bCs/>
                 <w:color w:val="FFFFFF"/>
@@ -1719,7 +1719,7 @@
             </w:r>
             <w:r>
               <w:rPr>
-                <w:rFonts w:ascii="Noto Kufi Arabic" w:hAnsi="Noto Kufi Arabic"/>
+                <w:rFonts w:ascii="Montserrat" w:hAnsi="Montserrat"/>
                 <w:b/>
                 <w:bCs/>
                 <w:color w:val="FFFFFF"/>
@@ -1758,7 +1758,7 @@
           <w:p>
             <w:r>
               <w:rPr>
-                <w:rFonts w:cs="Montserrat"/>
+                <w:rFonts w:cs="Readex Pro Light"/>
                 <w:color w:val="000000"/>
               </w:rPr>
               <w:t>Head Of Department</w:t>
@@ -1808,7 +1808,7 @@
             </w:pPr>
             <w:r>
               <w:rPr>
-                <w:rFonts w:ascii="Noto Kufi Arabic" w:hAnsi="Noto Kufi Arabic"/>
+                <w:rFonts w:ascii="Montserrat" w:hAnsi="Montserrat"/>
                 <w:color w:val="000000"/>
                 <w:rtl/>
               </w:rPr>
@@ -1843,7 +1843,7 @@
           <w:p>
             <w:r>
               <w:rPr>
-                <w:rFonts w:cs="Montserrat"/>
+                <w:rFonts w:cs="Readex Pro Light"/>
                 <w:color w:val="000000"/>
               </w:rPr>
               <w:t xml:space="preserve">Head of Division/Office  </w:t>
@@ -1893,7 +1893,7 @@
             </w:pPr>
             <w:r>
               <w:rPr>
-                <w:rFonts w:ascii="Noto Kufi Arabic" w:hAnsi="Noto Kufi Arabic"/>
+                <w:rFonts w:ascii="Montserrat" w:hAnsi="Montserrat"/>
                 <w:color w:val="000000"/>
                 <w:rtl/>
               </w:rPr>
@@ -1928,7 +1928,7 @@
           <w:p>
             <w:r>
               <w:rPr>
-                <w:rFonts w:cs="Montserrat"/>
+                <w:rFonts w:cs="Readex Pro Light"/>
                 <w:color w:val="000000"/>
               </w:rPr>
               <w:t>Head of Human Resource</w:t>
@@ -1978,7 +1978,7 @@
             </w:pPr>
             <w:r>
               <w:rPr>
-                <w:rFonts w:ascii="Noto Kufi Arabic" w:hAnsi="Noto Kufi Arabic"/>
+                <w:rFonts w:ascii="Montserrat" w:hAnsi="Montserrat"/>
                 <w:color w:val="000000"/>
                 <w:rtl/>
               </w:rPr>
@@ -2015,7 +2015,7 @@
           <w:p>
             <w:r>
               <w:rPr>
-                <w:rFonts w:cs="Montserrat"/>
+                <w:rFonts w:cs="Readex Pro Light"/>
                 <w:b/>
                 <w:bCs/>
                 <w:color w:val="FFFFFF"/>
@@ -2026,7 +2026,7 @@
             </w:r>
             <w:r>
               <w:rPr>
-                <w:rFonts w:cs="Montserrat"/>
+                <w:rFonts w:cs="Readex Pro Light"/>
                 <w:b/>
                 <w:bCs/>
                 <w:color w:val="FFFFFF"/>
@@ -2062,7 +2062,7 @@
             </w:pPr>
             <w:r>
               <w:rPr>
-                <w:rFonts w:ascii="Noto Kufi Arabic" w:hAnsi="Noto Kufi Arabic"/>
+                <w:rFonts w:ascii="Montserrat" w:hAnsi="Montserrat"/>
                 <w:b/>
                 <w:bCs/>
                 <w:color w:val="FFFFFF"/>
@@ -2074,7 +2074,7 @@
             </w:r>
             <w:r>
               <w:rPr>
-                <w:rFonts w:ascii="Noto Kufi Arabic" w:hAnsi="Noto Kufi Arabic"/>
+                <w:rFonts w:ascii="Montserrat" w:hAnsi="Montserrat"/>
                 <w:b/>
                 <w:bCs/>
                 <w:color w:val="FFFFFF"/>
@@ -2113,7 +2113,7 @@
           <w:p>
             <w:r>
               <w:rPr>
-                <w:rFonts w:cs="Montserrat"/>
+                <w:rFonts w:cs="Readex Pro Light"/>
                 <w:color w:val="000000"/>
               </w:rPr>
               <w:t>Administrative Director</w:t>
@@ -2163,7 +2163,7 @@
             </w:pPr>
             <w:r>
               <w:rPr>
-                <w:rFonts w:ascii="Noto Kufi Arabic" w:hAnsi="Noto Kufi Arabic"/>
+                <w:rFonts w:ascii="Montserrat" w:hAnsi="Montserrat"/>
                 <w:color w:val="000000"/>
                 <w:rtl/>
               </w:rPr>
@@ -2384,7 +2384,7 @@
         <w:ind w:left="720" w:hanging="360"/>
       </w:pPr>
       <w:rPr>
-        <w:rFonts w:ascii="Symbol" w:hAnsi="Symbol" w:hint="default"/>
+        <w:rFonts w:ascii="Montserrat" w:hAnsi="Montserrat" w:hint="default"/>
         <w:sz w:val="20"/>
       </w:rPr>
     </w:lvl>
@@ -2400,7 +2400,7 @@
         <w:ind w:left="1440" w:hanging="360"/>
       </w:pPr>
       <w:rPr>
-        <w:rFonts w:ascii="Courier New" w:hAnsi="Courier New" w:hint="default"/>
+        <w:rFonts w:ascii="Montserrat" w:hAnsi="Montserrat" w:hint="default"/>
         <w:sz w:val="20"/>
       </w:rPr>
     </w:lvl>
@@ -2416,7 +2416,7 @@
         <w:ind w:left="2160" w:hanging="360"/>
       </w:pPr>
       <w:rPr>
-        <w:rFonts w:ascii="Wingdings" w:hAnsi="Wingdings" w:hint="default"/>
+        <w:rFonts w:ascii="Montserrat" w:hAnsi="Montserrat" w:hint="default"/>
         <w:sz w:val="20"/>
       </w:rPr>
     </w:lvl>
@@ -2432,7 +2432,7 @@
         <w:ind w:left="2880" w:hanging="360"/>
       </w:pPr>
       <w:rPr>
-        <w:rFonts w:ascii="Wingdings" w:hAnsi="Wingdings" w:hint="default"/>
+        <w:rFonts w:ascii="Montserrat" w:hAnsi="Montserrat" w:hint="default"/>
         <w:sz w:val="20"/>
       </w:rPr>
     </w:lvl>
@@ -2448,7 +2448,7 @@
         <w:ind w:left="3600" w:hanging="360"/>
       </w:pPr>
       <w:rPr>
-        <w:rFonts w:ascii="Wingdings" w:hAnsi="Wingdings" w:hint="default"/>
+        <w:rFonts w:ascii="Montserrat" w:hAnsi="Montserrat" w:hint="default"/>
         <w:sz w:val="20"/>
       </w:rPr>
     </w:lvl>
@@ -2464,7 +2464,7 @@
         <w:ind w:left="4320" w:hanging="360"/>
       </w:pPr>
       <w:rPr>
-        <w:rFonts w:ascii="Wingdings" w:hAnsi="Wingdings" w:hint="default"/>
+        <w:rFonts w:ascii="Montserrat" w:hAnsi="Montserrat" w:hint="default"/>
         <w:sz w:val="20"/>
       </w:rPr>
     </w:lvl>
@@ -2480,7 +2480,7 @@
         <w:ind w:left="5040" w:hanging="360"/>
       </w:pPr>
       <w:rPr>
-        <w:rFonts w:ascii="Wingdings" w:hAnsi="Wingdings" w:hint="default"/>
+        <w:rFonts w:ascii="Montserrat" w:hAnsi="Montserrat" w:hint="default"/>
         <w:sz w:val="20"/>
       </w:rPr>
     </w:lvl>
@@ -2496,7 +2496,7 @@
         <w:ind w:left="5760" w:hanging="360"/>
       </w:pPr>
       <w:rPr>
-        <w:rFonts w:ascii="Wingdings" w:hAnsi="Wingdings" w:hint="default"/>
+        <w:rFonts w:ascii="Montserrat" w:hAnsi="Montserrat" w:hint="default"/>
         <w:sz w:val="20"/>
       </w:rPr>
     </w:lvl>
@@ -2512,7 +2512,7 @@
         <w:ind w:left="6480" w:hanging="360"/>
       </w:pPr>
       <w:rPr>
-        <w:rFonts w:ascii="Wingdings" w:hAnsi="Wingdings" w:hint="default"/>
+        <w:rFonts w:ascii="Montserrat" w:hAnsi="Montserrat" w:hint="default"/>
         <w:sz w:val="20"/>
       </w:rPr>
     </w:lvl>
@@ -2533,7 +2533,7 @@
         <w:ind w:left="720" w:hanging="360"/>
       </w:pPr>
       <w:rPr>
-        <w:rFonts w:ascii="Symbol" w:hAnsi="Symbol" w:hint="default"/>
+        <w:rFonts w:ascii="Montserrat" w:hAnsi="Montserrat" w:hint="default"/>
         <w:sz w:val="20"/>
       </w:rPr>
     </w:lvl>
@@ -2549,7 +2549,7 @@
         <w:ind w:left="1440" w:hanging="360"/>
       </w:pPr>
       <w:rPr>
-        <w:rFonts w:ascii="Courier New" w:hAnsi="Courier New" w:hint="default"/>
+        <w:rFonts w:ascii="Montserrat" w:hAnsi="Montserrat" w:hint="default"/>
         <w:sz w:val="20"/>
       </w:rPr>
     </w:lvl>
@@ -2565,7 +2565,7 @@
         <w:ind w:left="2160" w:hanging="360"/>
       </w:pPr>
       <w:rPr>
-        <w:rFonts w:ascii="Wingdings" w:hAnsi="Wingdings" w:hint="default"/>
+        <w:rFonts w:ascii="Montserrat" w:hAnsi="Montserrat" w:hint="default"/>
         <w:sz w:val="20"/>
       </w:rPr>
     </w:lvl>
@@ -2581,7 +2581,7 @@
         <w:ind w:left="2880" w:hanging="360"/>
       </w:pPr>
       <w:rPr>
-        <w:rFonts w:ascii="Wingdings" w:hAnsi="Wingdings" w:hint="default"/>
+        <w:rFonts w:ascii="Montserrat" w:hAnsi="Montserrat" w:hint="default"/>
         <w:sz w:val="20"/>
       </w:rPr>
     </w:lvl>
@@ -2597,7 +2597,7 @@
         <w:ind w:left="3600" w:hanging="360"/>
       </w:pPr>
       <w:rPr>
-        <w:rFonts w:ascii="Wingdings" w:hAnsi="Wingdings" w:hint="default"/>
+        <w:rFonts w:ascii="Montserrat" w:hAnsi="Montserrat" w:hint="default"/>
         <w:sz w:val="20"/>
       </w:rPr>
     </w:lvl>
@@ -2613,7 +2613,7 @@
         <w:ind w:left="4320" w:hanging="360"/>
       </w:pPr>
       <w:rPr>
-        <w:rFonts w:ascii="Wingdings" w:hAnsi="Wingdings" w:hint="default"/>
+        <w:rFonts w:ascii="Montserrat" w:hAnsi="Montserrat" w:hint="default"/>
         <w:sz w:val="20"/>
       </w:rPr>
     </w:lvl>
@@ -2629,7 +2629,7 @@
         <w:ind w:left="5040" w:hanging="360"/>
       </w:pPr>
       <w:rPr>
-        <w:rFonts w:ascii="Wingdings" w:hAnsi="Wingdings" w:hint="default"/>
+        <w:rFonts w:ascii="Montserrat" w:hAnsi="Montserrat" w:hint="default"/>
         <w:sz w:val="20"/>
       </w:rPr>
     </w:lvl>
@@ -2645,7 +2645,7 @@
         <w:ind w:left="5760" w:hanging="360"/>
       </w:pPr>
       <w:rPr>
-        <w:rFonts w:ascii="Wingdings" w:hAnsi="Wingdings" w:hint="default"/>
+        <w:rFonts w:ascii="Montserrat" w:hAnsi="Montserrat" w:hint="default"/>
         <w:sz w:val="20"/>
       </w:rPr>
     </w:lvl>
@@ -2661,7 +2661,7 @@
         <w:ind w:left="6480" w:hanging="360"/>
       </w:pPr>
       <w:rPr>
-        <w:rFonts w:ascii="Wingdings" w:hAnsi="Wingdings" w:hint="default"/>
+        <w:rFonts w:ascii="Montserrat" w:hAnsi="Montserrat" w:hint="default"/>
         <w:sz w:val="20"/>
       </w:rPr>
     </w:lvl>
@@ -2679,7 +2679,7 @@
         <w:ind w:left="720" w:hanging="360"/>
       </w:pPr>
       <w:rPr>
-        <w:rFonts w:ascii="Symbol" w:hAnsi="Symbol" w:hint="default"/>
+        <w:rFonts w:ascii="Montserrat" w:hAnsi="Montserrat" w:hint="default"/>
       </w:rPr>
     </w:lvl>
     <w:lvl w:ilvl="1" w:tplc="04090003" w:tentative="1">
@@ -2691,7 +2691,7 @@
         <w:ind w:left="1440" w:hanging="360"/>
       </w:pPr>
       <w:rPr>
-        <w:rFonts w:ascii="Courier New" w:hAnsi="Courier New" w:cs="Courier New" w:hint="default"/>
+        <w:rFonts w:ascii="Montserrat" w:hAnsi="Montserrat" w:cs="Readex Pro Light" w:hint="default"/>
       </w:rPr>
     </w:lvl>
     <w:lvl w:ilvl="2" w:tplc="04090005" w:tentative="1">
@@ -2703,7 +2703,7 @@
         <w:ind w:left="2160" w:hanging="360"/>
       </w:pPr>
       <w:rPr>
-        <w:rFonts w:ascii="Wingdings" w:hAnsi="Wingdings" w:hint="default"/>
+        <w:rFonts w:ascii="Montserrat" w:hAnsi="Montserrat" w:hint="default"/>
       </w:rPr>
     </w:lvl>
     <w:lvl w:ilvl="3" w:tplc="04090001" w:tentative="1">
@@ -2715,7 +2715,7 @@
         <w:ind w:left="2880" w:hanging="360"/>
       </w:pPr>
       <w:rPr>
-        <w:rFonts w:ascii="Symbol" w:hAnsi="Symbol" w:hint="default"/>
+        <w:rFonts w:ascii="Montserrat" w:hAnsi="Montserrat" w:hint="default"/>
       </w:rPr>
     </w:lvl>
     <w:lvl w:ilvl="4" w:tplc="04090003" w:tentative="1">
@@ -2727,7 +2727,7 @@
         <w:ind w:left="3600" w:hanging="360"/>
       </w:pPr>
       <w:rPr>
-        <w:rFonts w:ascii="Courier New" w:hAnsi="Courier New" w:cs="Courier New" w:hint="default"/>
+        <w:rFonts w:ascii="Montserrat" w:hAnsi="Montserrat" w:cs="Readex Pro Light" w:hint="default"/>
       </w:rPr>
     </w:lvl>
     <w:lvl w:ilvl="5" w:tplc="04090005" w:tentative="1">
@@ -2739,7 +2739,7 @@
         <w:ind w:left="4320" w:hanging="360"/>
       </w:pPr>
       <w:rPr>
-        <w:rFonts w:ascii="Wingdings" w:hAnsi="Wingdings" w:hint="default"/>
+        <w:rFonts w:ascii="Montserrat" w:hAnsi="Montserrat" w:hint="default"/>
       </w:rPr>
     </w:lvl>
     <w:lvl w:ilvl="6" w:tplc="04090001" w:tentative="1">
@@ -2751,7 +2751,7 @@
         <w:ind w:left="5040" w:hanging="360"/>
       </w:pPr>
       <w:rPr>
-        <w:rFonts w:ascii="Symbol" w:hAnsi="Symbol" w:hint="default"/>
+        <w:rFonts w:ascii="Montserrat" w:hAnsi="Montserrat" w:hint="default"/>
       </w:rPr>
     </w:lvl>
     <w:lvl w:ilvl="7" w:tplc="04090003" w:tentative="1">
@@ -2763,7 +2763,7 @@
         <w:ind w:left="5760" w:hanging="360"/>
       </w:pPr>
       <w:rPr>
-        <w:rFonts w:ascii="Courier New" w:hAnsi="Courier New" w:cs="Courier New" w:hint="default"/>
+        <w:rFonts w:ascii="Montserrat" w:hAnsi="Montserrat" w:cs="Readex Pro Light" w:hint="default"/>
       </w:rPr>
     </w:lvl>
     <w:lvl w:ilvl="8" w:tplc="04090005" w:tentative="1">
@@ -2775,7 +2775,7 @@
         <w:ind w:left="6480" w:hanging="360"/>
       </w:pPr>
       <w:rPr>
-        <w:rFonts w:ascii="Wingdings" w:hAnsi="Wingdings" w:hint="default"/>
+        <w:rFonts w:ascii="Montserrat" w:hAnsi="Montserrat" w:hint="default"/>
       </w:rPr>
     </w:lvl>
   </w:abstractNum>
@@ -2792,7 +2792,7 @@
         <w:ind w:left="720" w:hanging="360"/>
       </w:pPr>
       <w:rPr>
-        <w:rFonts w:ascii="Symbol" w:hAnsi="Symbol" w:hint="default"/>
+        <w:rFonts w:ascii="Montserrat" w:hAnsi="Montserrat" w:hint="default"/>
       </w:rPr>
     </w:lvl>
     <w:lvl w:ilvl="1" w:tplc="04090003" w:tentative="1">
@@ -2804,7 +2804,7 @@
         <w:ind w:left="1440" w:hanging="360"/>
       </w:pPr>
       <w:rPr>
-        <w:rFonts w:ascii="Courier New" w:hAnsi="Courier New" w:cs="Courier New" w:hint="default"/>
+        <w:rFonts w:ascii="Montserrat" w:hAnsi="Montserrat" w:cs="Readex Pro Light" w:hint="default"/>
       </w:rPr>
     </w:lvl>
     <w:lvl w:ilvl="2" w:tplc="04090005" w:tentative="1">
@@ -2816,7 +2816,7 @@
         <w:ind w:left="2160" w:hanging="360"/>
       </w:pPr>
       <w:rPr>
-        <w:rFonts w:ascii="Wingdings" w:hAnsi="Wingdings" w:hint="default"/>
+        <w:rFonts w:ascii="Montserrat" w:hAnsi="Montserrat" w:hint="default"/>
       </w:rPr>
     </w:lvl>
     <w:lvl w:ilvl="3" w:tplc="04090001" w:tentative="1">
@@ -2828,7 +2828,7 @@
         <w:ind w:left="2880" w:hanging="360"/>
       </w:pPr>
       <w:rPr>
-        <w:rFonts w:ascii="Symbol" w:hAnsi="Symbol" w:hint="default"/>
+        <w:rFonts w:ascii="Montserrat" w:hAnsi="Montserrat" w:hint="default"/>
       </w:rPr>
     </w:lvl>
     <w:lvl w:ilvl="4" w:tplc="04090003" w:tentative="1">
@@ -2840,7 +2840,7 @@
         <w:ind w:left="3600" w:hanging="360"/>
       </w:pPr>
       <w:rPr>
-        <w:rFonts w:ascii="Courier New" w:hAnsi="Courier New" w:cs="Courier New" w:hint="default"/>
+        <w:rFonts w:ascii="Montserrat" w:hAnsi="Montserrat" w:cs="Readex Pro Light" w:hint="default"/>
       </w:rPr>
     </w:lvl>
     <w:lvl w:ilvl="5" w:tplc="04090005" w:tentative="1">
@@ -2852,7 +2852,7 @@
         <w:ind w:left="4320" w:hanging="360"/>
       </w:pPr>
       <w:rPr>
-        <w:rFonts w:ascii="Wingdings" w:hAnsi="Wingdings" w:hint="default"/>
+        <w:rFonts w:ascii="Montserrat" w:hAnsi="Montserrat" w:hint="default"/>
       </w:rPr>
     </w:lvl>
     <w:lvl w:ilvl="6" w:tplc="04090001" w:tentative="1">
@@ -2864,7 +2864,7 @@
         <w:ind w:left="5040" w:hanging="360"/>
       </w:pPr>
       <w:rPr>
-        <w:rFonts w:ascii="Symbol" w:hAnsi="Symbol" w:hint="default"/>
+        <w:rFonts w:ascii="Montserrat" w:hAnsi="Montserrat" w:hint="default"/>
       </w:rPr>
     </w:lvl>
     <w:lvl w:ilvl="7" w:tplc="04090003" w:tentative="1">
@@ -2876,7 +2876,7 @@
         <w:ind w:left="5760" w:hanging="360"/>
       </w:pPr>
       <w:rPr>
-        <w:rFonts w:ascii="Courier New" w:hAnsi="Courier New" w:cs="Courier New" w:hint="default"/>
+        <w:rFonts w:ascii="Montserrat" w:hAnsi="Montserrat" w:cs="Readex Pro Light" w:hint="default"/>
       </w:rPr>
     </w:lvl>
     <w:lvl w:ilvl="8" w:tplc="04090005" w:tentative="1">
@@ -2888,7 +2888,7 @@
         <w:ind w:left="6480" w:hanging="360"/>
       </w:pPr>
       <w:rPr>
-        <w:rFonts w:ascii="Wingdings" w:hAnsi="Wingdings" w:hint="default"/>
+        <w:rFonts w:ascii="Montserrat" w:hAnsi="Montserrat" w:hint="default"/>
       </w:rPr>
     </w:lvl>
   </w:abstractNum>
@@ -2908,7 +2908,7 @@
         <w:ind w:left="720" w:hanging="360"/>
       </w:pPr>
       <w:rPr>
-        <w:rFonts w:ascii="Symbol" w:hAnsi="Symbol" w:hint="default"/>
+        <w:rFonts w:ascii="Montserrat" w:hAnsi="Montserrat" w:hint="default"/>
         <w:sz w:val="20"/>
       </w:rPr>
     </w:lvl>
@@ -2924,7 +2924,7 @@
         <w:ind w:left="1440" w:hanging="360"/>
       </w:pPr>
       <w:rPr>
-        <w:rFonts w:ascii="Courier New" w:hAnsi="Courier New" w:hint="default"/>
+        <w:rFonts w:ascii="Montserrat" w:hAnsi="Montserrat" w:hint="default"/>
         <w:sz w:val="20"/>
       </w:rPr>
     </w:lvl>
@@ -2940,7 +2940,7 @@
         <w:ind w:left="2160" w:hanging="360"/>
       </w:pPr>
       <w:rPr>
-        <w:rFonts w:ascii="Wingdings" w:hAnsi="Wingdings" w:hint="default"/>
+        <w:rFonts w:ascii="Montserrat" w:hAnsi="Montserrat" w:hint="default"/>
         <w:sz w:val="20"/>
       </w:rPr>
     </w:lvl>
@@ -2956,7 +2956,7 @@
         <w:ind w:left="2880" w:hanging="360"/>
       </w:pPr>
       <w:rPr>
-        <w:rFonts w:ascii="Wingdings" w:hAnsi="Wingdings" w:hint="default"/>
+        <w:rFonts w:ascii="Montserrat" w:hAnsi="Montserrat" w:hint="default"/>
         <w:sz w:val="20"/>
       </w:rPr>
     </w:lvl>
@@ -2972,7 +2972,7 @@
         <w:ind w:left="3600" w:hanging="360"/>
       </w:pPr>
       <w:rPr>
-        <w:rFonts w:ascii="Wingdings" w:hAnsi="Wingdings" w:hint="default"/>
+        <w:rFonts w:ascii="Montserrat" w:hAnsi="Montserrat" w:hint="default"/>
         <w:sz w:val="20"/>
       </w:rPr>
     </w:lvl>
@@ -2988,7 +2988,7 @@
         <w:ind w:left="4320" w:hanging="360"/>
       </w:pPr>
       <w:rPr>
-        <w:rFonts w:ascii="Wingdings" w:hAnsi="Wingdings" w:hint="default"/>
+        <w:rFonts w:ascii="Montserrat" w:hAnsi="Montserrat" w:hint="default"/>
         <w:sz w:val="20"/>
       </w:rPr>
     </w:lvl>
@@ -3004,7 +3004,7 @@
         <w:ind w:left="5040" w:hanging="360"/>
       </w:pPr>
       <w:rPr>
-        <w:rFonts w:ascii="Wingdings" w:hAnsi="Wingdings" w:hint="default"/>
+        <w:rFonts w:ascii="Montserrat" w:hAnsi="Montserrat" w:hint="default"/>
         <w:sz w:val="20"/>
       </w:rPr>
     </w:lvl>
@@ -3020,7 +3020,7 @@
         <w:ind w:left="5760" w:hanging="360"/>
       </w:pPr>
       <w:rPr>
-        <w:rFonts w:ascii="Wingdings" w:hAnsi="Wingdings" w:hint="default"/>
+        <w:rFonts w:ascii="Montserrat" w:hAnsi="Montserrat" w:hint="default"/>
         <w:sz w:val="20"/>
       </w:rPr>
     </w:lvl>
@@ -3036,7 +3036,7 @@
         <w:ind w:left="6480" w:hanging="360"/>
       </w:pPr>
       <w:rPr>
-        <w:rFonts w:ascii="Wingdings" w:hAnsi="Wingdings" w:hint="default"/>
+        <w:rFonts w:ascii="Montserrat" w:hAnsi="Montserrat" w:hint="default"/>
         <w:sz w:val="20"/>
       </w:rPr>
     </w:lvl>
@@ -3054,7 +3054,7 @@
         <w:ind w:left="720" w:hanging="360"/>
       </w:pPr>
       <w:rPr>
-        <w:rFonts w:ascii="Symbol" w:hAnsi="Symbol" w:hint="default"/>
+        <w:rFonts w:ascii="Montserrat" w:hAnsi="Montserrat" w:hint="default"/>
       </w:rPr>
     </w:lvl>
     <w:lvl w:ilvl="1" w:tplc="04090003" w:tentative="1">
@@ -3066,7 +3066,7 @@
         <w:ind w:left="1440" w:hanging="360"/>
       </w:pPr>
       <w:rPr>
-        <w:rFonts w:ascii="Courier New" w:hAnsi="Courier New" w:cs="Courier New" w:hint="default"/>
+        <w:rFonts w:ascii="Montserrat" w:hAnsi="Montserrat" w:cs="Readex Pro Light" w:hint="default"/>
       </w:rPr>
     </w:lvl>
     <w:lvl w:ilvl="2" w:tplc="04090005" w:tentative="1">
@@ -3078,7 +3078,7 @@
         <w:ind w:left="2160" w:hanging="360"/>
       </w:pPr>
       <w:rPr>
-        <w:rFonts w:ascii="Wingdings" w:hAnsi="Wingdings" w:hint="default"/>
+        <w:rFonts w:ascii="Montserrat" w:hAnsi="Montserrat" w:hint="default"/>
       </w:rPr>
     </w:lvl>
     <w:lvl w:ilvl="3" w:tplc="04090001" w:tentative="1">
@@ -3090,7 +3090,7 @@
         <w:ind w:left="2880" w:hanging="360"/>
       </w:pPr>
       <w:rPr>
-        <w:rFonts w:ascii="Symbol" w:hAnsi="Symbol" w:hint="default"/>
+        <w:rFonts w:ascii="Montserrat" w:hAnsi="Montserrat" w:hint="default"/>
       </w:rPr>
     </w:lvl>
     <w:lvl w:ilvl="4" w:tplc="04090003" w:tentative="1">
@@ -3102,7 +3102,7 @@
         <w:ind w:left="3600" w:hanging="360"/>
       </w:pPr>
       <w:rPr>
-        <w:rFonts w:ascii="Courier New" w:hAnsi="Courier New" w:cs="Courier New" w:hint="default"/>
+        <w:rFonts w:ascii="Montserrat" w:hAnsi="Montserrat" w:cs="Readex Pro Light" w:hint="default"/>
       </w:rPr>
     </w:lvl>
     <w:lvl w:ilvl="5" w:tplc="04090005" w:tentative="1">
@@ -3114,7 +3114,7 @@
         <w:ind w:left="4320" w:hanging="360"/>
       </w:pPr>
       <w:rPr>
-        <w:rFonts w:ascii="Wingdings" w:hAnsi="Wingdings" w:hint="default"/>
+        <w:rFonts w:ascii="Montserrat" w:hAnsi="Montserrat" w:hint="default"/>
       </w:rPr>
     </w:lvl>
     <w:lvl w:ilvl="6" w:tplc="04090001" w:tentative="1">
@@ -3126,7 +3126,7 @@
         <w:ind w:left="5040" w:hanging="360"/>
       </w:pPr>
       <w:rPr>
-        <w:rFonts w:ascii="Symbol" w:hAnsi="Symbol" w:hint="default"/>
+        <w:rFonts w:ascii="Montserrat" w:hAnsi="Montserrat" w:hint="default"/>
       </w:rPr>
     </w:lvl>
     <w:lvl w:ilvl="7" w:tplc="04090003" w:tentative="1">
@@ -3138,7 +3138,7 @@
         <w:ind w:left="5760" w:hanging="360"/>
       </w:pPr>
       <w:rPr>
-        <w:rFonts w:ascii="Courier New" w:hAnsi="Courier New" w:cs="Courier New" w:hint="default"/>
+        <w:rFonts w:ascii="Montserrat" w:hAnsi="Montserrat" w:cs="Readex Pro Light" w:hint="default"/>
       </w:rPr>
     </w:lvl>
     <w:lvl w:ilvl="8" w:tplc="04090005" w:tentative="1">
@@ -3150,7 +3150,7 @@
         <w:ind w:left="6480" w:hanging="360"/>
       </w:pPr>
       <w:rPr>
-        <w:rFonts w:ascii="Wingdings" w:hAnsi="Wingdings" w:hint="default"/>
+        <w:rFonts w:ascii="Montserrat" w:hAnsi="Montserrat" w:hint="default"/>
       </w:rPr>
     </w:lvl>
   </w:abstractNum>
@@ -3170,7 +3170,7 @@
         <w:ind w:left="720" w:hanging="360"/>
       </w:pPr>
       <w:rPr>
-        <w:rFonts w:ascii="Symbol" w:hAnsi="Symbol" w:hint="default"/>
+        <w:rFonts w:ascii="Montserrat" w:hAnsi="Montserrat" w:hint="default"/>
         <w:sz w:val="20"/>
       </w:rPr>
     </w:lvl>
@@ -3186,7 +3186,7 @@
         <w:ind w:left="1440" w:hanging="360"/>
       </w:pPr>
       <w:rPr>
-        <w:rFonts w:ascii="Courier New" w:hAnsi="Courier New" w:hint="default"/>
+        <w:rFonts w:ascii="Montserrat" w:hAnsi="Montserrat" w:hint="default"/>
         <w:sz w:val="20"/>
       </w:rPr>
     </w:lvl>
@@ -3202,7 +3202,7 @@
         <w:ind w:left="2160" w:hanging="360"/>
       </w:pPr>
       <w:rPr>
-        <w:rFonts w:ascii="Wingdings" w:hAnsi="Wingdings" w:hint="default"/>
+        <w:rFonts w:ascii="Montserrat" w:hAnsi="Montserrat" w:hint="default"/>
         <w:sz w:val="20"/>
       </w:rPr>
     </w:lvl>
@@ -3218,7 +3218,7 @@
         <w:ind w:left="2880" w:hanging="360"/>
       </w:pPr>
       <w:rPr>
-        <w:rFonts w:ascii="Wingdings" w:hAnsi="Wingdings" w:hint="default"/>
+        <w:rFonts w:ascii="Montserrat" w:hAnsi="Montserrat" w:hint="default"/>
         <w:sz w:val="20"/>
       </w:rPr>
     </w:lvl>
@@ -3234,7 +3234,7 @@
         <w:ind w:left="3600" w:hanging="360"/>
       </w:pPr>
       <w:rPr>
-        <w:rFonts w:ascii="Wingdings" w:hAnsi="Wingdings" w:hint="default"/>
+        <w:rFonts w:ascii="Montserrat" w:hAnsi="Montserrat" w:hint="default"/>
         <w:sz w:val="20"/>
       </w:rPr>
     </w:lvl>
@@ -3250,7 +3250,7 @@
         <w:ind w:left="4320" w:hanging="360"/>
       </w:pPr>
       <w:rPr>
-        <w:rFonts w:ascii="Wingdings" w:hAnsi="Wingdings" w:hint="default"/>
+        <w:rFonts w:ascii="Montserrat" w:hAnsi="Montserrat" w:hint="default"/>
         <w:sz w:val="20"/>
       </w:rPr>
     </w:lvl>
@@ -3266,7 +3266,7 @@
         <w:ind w:left="5040" w:hanging="360"/>
       </w:pPr>
       <w:rPr>
-        <w:rFonts w:ascii="Wingdings" w:hAnsi="Wingdings" w:hint="default"/>
+        <w:rFonts w:ascii="Montserrat" w:hAnsi="Montserrat" w:hint="default"/>
         <w:sz w:val="20"/>
       </w:rPr>
     </w:lvl>
@@ -3282,7 +3282,7 @@
         <w:ind w:left="5760" w:hanging="360"/>
       </w:pPr>
       <w:rPr>
-        <w:rFonts w:ascii="Wingdings" w:hAnsi="Wingdings" w:hint="default"/>
+        <w:rFonts w:ascii="Montserrat" w:hAnsi="Montserrat" w:hint="default"/>
         <w:sz w:val="20"/>
       </w:rPr>
     </w:lvl>
@@ -3298,7 +3298,7 @@
         <w:ind w:left="6480" w:hanging="360"/>
       </w:pPr>
       <w:rPr>
-        <w:rFonts w:ascii="Wingdings" w:hAnsi="Wingdings" w:hint="default"/>
+        <w:rFonts w:ascii="Montserrat" w:hAnsi="Montserrat" w:hint="default"/>
         <w:sz w:val="20"/>
       </w:rPr>
     </w:lvl>
@@ -3319,7 +3319,7 @@
         <w:ind w:left="720" w:hanging="360"/>
       </w:pPr>
       <w:rPr>
-        <w:rFonts w:ascii="Symbol" w:hAnsi="Symbol" w:hint="default"/>
+        <w:rFonts w:ascii="Montserrat" w:hAnsi="Montserrat" w:hint="default"/>
         <w:sz w:val="20"/>
       </w:rPr>
     </w:lvl>
@@ -3335,7 +3335,7 @@
         <w:ind w:left="1440" w:hanging="360"/>
       </w:pPr>
       <w:rPr>
-        <w:rFonts w:ascii="Courier New" w:hAnsi="Courier New" w:hint="default"/>
+        <w:rFonts w:ascii="Montserrat" w:hAnsi="Montserrat" w:hint="default"/>
         <w:sz w:val="20"/>
       </w:rPr>
     </w:lvl>
@@ -3351,7 +3351,7 @@
         <w:ind w:left="2160" w:hanging="360"/>
       </w:pPr>
       <w:rPr>
-        <w:rFonts w:ascii="Wingdings" w:hAnsi="Wingdings" w:hint="default"/>
+        <w:rFonts w:ascii="Montserrat" w:hAnsi="Montserrat" w:hint="default"/>
         <w:sz w:val="20"/>
       </w:rPr>
     </w:lvl>
@@ -3367,7 +3367,7 @@
         <w:ind w:left="2880" w:hanging="360"/>
       </w:pPr>
       <w:rPr>
-        <w:rFonts w:ascii="Wingdings" w:hAnsi="Wingdings" w:hint="default"/>
+        <w:rFonts w:ascii="Montserrat" w:hAnsi="Montserrat" w:hint="default"/>
         <w:sz w:val="20"/>
       </w:rPr>
     </w:lvl>
@@ -3383,7 +3383,7 @@
         <w:ind w:left="3600" w:hanging="360"/>
       </w:pPr>
       <w:rPr>
-        <w:rFonts w:ascii="Wingdings" w:hAnsi="Wingdings" w:hint="default"/>
+        <w:rFonts w:ascii="Montserrat" w:hAnsi="Montserrat" w:hint="default"/>
         <w:sz w:val="20"/>
       </w:rPr>
     </w:lvl>
@@ -3399,7 +3399,7 @@
         <w:ind w:left="4320" w:hanging="360"/>
       </w:pPr>
       <w:rPr>
-        <w:rFonts w:ascii="Wingdings" w:hAnsi="Wingdings" w:hint="default"/>
+        <w:rFonts w:ascii="Montserrat" w:hAnsi="Montserrat" w:hint="default"/>
         <w:sz w:val="20"/>
       </w:rPr>
     </w:lvl>
@@ -3415,7 +3415,7 @@
         <w:ind w:left="5040" w:hanging="360"/>
       </w:pPr>
       <w:rPr>
-        <w:rFonts w:ascii="Wingdings" w:hAnsi="Wingdings" w:hint="default"/>
+        <w:rFonts w:ascii="Montserrat" w:hAnsi="Montserrat" w:hint="default"/>
         <w:sz w:val="20"/>
       </w:rPr>
     </w:lvl>
@@ -3431,7 +3431,7 @@
         <w:ind w:left="5760" w:hanging="360"/>
       </w:pPr>
       <w:rPr>
-        <w:rFonts w:ascii="Wingdings" w:hAnsi="Wingdings" w:hint="default"/>
+        <w:rFonts w:ascii="Montserrat" w:hAnsi="Montserrat" w:hint="default"/>
         <w:sz w:val="20"/>
       </w:rPr>
     </w:lvl>
@@ -3447,7 +3447,7 @@
         <w:ind w:left="6480" w:hanging="360"/>
       </w:pPr>
       <w:rPr>
-        <w:rFonts w:ascii="Wingdings" w:hAnsi="Wingdings" w:hint="default"/>
+        <w:rFonts w:ascii="Montserrat" w:hAnsi="Montserrat" w:hint="default"/>
         <w:sz w:val="20"/>
       </w:rPr>
     </w:lvl>
@@ -3952,7 +3952,7 @@
         <w:ind w:left="720" w:hanging="360"/>
       </w:pPr>
       <w:rPr>
-        <w:rFonts w:ascii="Symbol" w:hAnsi="Symbol" w:hint="default"/>
+        <w:rFonts w:ascii="Montserrat" w:hAnsi="Montserrat" w:hint="default"/>
         <w:sz w:val="20"/>
       </w:rPr>
     </w:lvl>
@@ -3968,7 +3968,7 @@
         <w:ind w:left="1440" w:hanging="360"/>
       </w:pPr>
       <w:rPr>
-        <w:rFonts w:ascii="Courier New" w:hAnsi="Courier New" w:hint="default"/>
+        <w:rFonts w:ascii="Montserrat" w:hAnsi="Montserrat" w:hint="default"/>
         <w:sz w:val="20"/>
       </w:rPr>
     </w:lvl>
@@ -3984,7 +3984,7 @@
         <w:ind w:left="2160" w:hanging="360"/>
       </w:pPr>
       <w:rPr>
-        <w:rFonts w:ascii="Wingdings" w:hAnsi="Wingdings" w:hint="default"/>
+        <w:rFonts w:ascii="Montserrat" w:hAnsi="Montserrat" w:hint="default"/>
         <w:sz w:val="20"/>
       </w:rPr>
     </w:lvl>
@@ -4000,7 +4000,7 @@
         <w:ind w:left="2880" w:hanging="360"/>
       </w:pPr>
       <w:rPr>
-        <w:rFonts w:ascii="Wingdings" w:hAnsi="Wingdings" w:hint="default"/>
+        <w:rFonts w:ascii="Montserrat" w:hAnsi="Montserrat" w:hint="default"/>
         <w:sz w:val="20"/>
       </w:rPr>
     </w:lvl>
@@ -4016,7 +4016,7 @@
         <w:ind w:left="3600" w:hanging="360"/>
       </w:pPr>
       <w:rPr>
-        <w:rFonts w:ascii="Wingdings" w:hAnsi="Wingdings" w:hint="default"/>
+        <w:rFonts w:ascii="Montserrat" w:hAnsi="Montserrat" w:hint="default"/>
         <w:sz w:val="20"/>
       </w:rPr>
     </w:lvl>
@@ -4032,7 +4032,7 @@
         <w:ind w:left="4320" w:hanging="360"/>
       </w:pPr>
       <w:rPr>
-        <w:rFonts w:ascii="Wingdings" w:hAnsi="Wingdings" w:hint="default"/>
+        <w:rFonts w:ascii="Montserrat" w:hAnsi="Montserrat" w:hint="default"/>
         <w:sz w:val="20"/>
       </w:rPr>
     </w:lvl>
@@ -4048,7 +4048,7 @@
         <w:ind w:left="5040" w:hanging="360"/>
       </w:pPr>
       <w:rPr>
-        <w:rFonts w:ascii="Wingdings" w:hAnsi="Wingdings" w:hint="default"/>
+        <w:rFonts w:ascii="Montserrat" w:hAnsi="Montserrat" w:hint="default"/>
         <w:sz w:val="20"/>
       </w:rPr>
     </w:lvl>
@@ -4064,7 +4064,7 @@
         <w:ind w:left="5760" w:hanging="360"/>
       </w:pPr>
       <w:rPr>
-        <w:rFonts w:ascii="Wingdings" w:hAnsi="Wingdings" w:hint="default"/>
+        <w:rFonts w:ascii="Montserrat" w:hAnsi="Montserrat" w:hint="default"/>
         <w:sz w:val="20"/>
       </w:rPr>
     </w:lvl>
@@ -4080,7 +4080,7 @@
         <w:ind w:left="6480" w:hanging="360"/>
       </w:pPr>
       <w:rPr>
-        <w:rFonts w:ascii="Wingdings" w:hAnsi="Wingdings" w:hint="default"/>
+        <w:rFonts w:ascii="Montserrat" w:hAnsi="Montserrat" w:hint="default"/>
         <w:sz w:val="20"/>
       </w:rPr>
     </w:lvl>
@@ -4101,7 +4101,7 @@
         <w:ind w:left="720" w:hanging="360"/>
       </w:pPr>
       <w:rPr>
-        <w:rFonts w:ascii="Symbol" w:hAnsi="Symbol" w:hint="default"/>
+        <w:rFonts w:ascii="Montserrat" w:hAnsi="Montserrat" w:hint="default"/>
         <w:sz w:val="20"/>
       </w:rPr>
     </w:lvl>
@@ -4117,7 +4117,7 @@
         <w:ind w:left="1440" w:hanging="360"/>
       </w:pPr>
       <w:rPr>
-        <w:rFonts w:ascii="Courier New" w:hAnsi="Courier New" w:hint="default"/>
+        <w:rFonts w:ascii="Montserrat" w:hAnsi="Montserrat" w:hint="default"/>
         <w:sz w:val="20"/>
       </w:rPr>
     </w:lvl>
@@ -4133,7 +4133,7 @@
         <w:ind w:left="2160" w:hanging="360"/>
       </w:pPr>
       <w:rPr>
-        <w:rFonts w:ascii="Wingdings" w:hAnsi="Wingdings" w:hint="default"/>
+        <w:rFonts w:ascii="Montserrat" w:hAnsi="Montserrat" w:hint="default"/>
         <w:sz w:val="20"/>
       </w:rPr>
     </w:lvl>
@@ -4149,7 +4149,7 @@
         <w:ind w:left="2880" w:hanging="360"/>
       </w:pPr>
       <w:rPr>
-        <w:rFonts w:ascii="Wingdings" w:hAnsi="Wingdings" w:hint="default"/>
+        <w:rFonts w:ascii="Montserrat" w:hAnsi="Montserrat" w:hint="default"/>
         <w:sz w:val="20"/>
       </w:rPr>
     </w:lvl>
@@ -4165,7 +4165,7 @@
         <w:ind w:left="3600" w:hanging="360"/>
       </w:pPr>
       <w:rPr>
-        <w:rFonts w:ascii="Wingdings" w:hAnsi="Wingdings" w:hint="default"/>
+        <w:rFonts w:ascii="Montserrat" w:hAnsi="Montserrat" w:hint="default"/>
         <w:sz w:val="20"/>
       </w:rPr>
     </w:lvl>
@@ -4181,7 +4181,7 @@
         <w:ind w:left="4320" w:hanging="360"/>
       </w:pPr>
       <w:rPr>
-        <w:rFonts w:ascii="Wingdings" w:hAnsi="Wingdings" w:hint="default"/>
+        <w:rFonts w:ascii="Montserrat" w:hAnsi="Montserrat" w:hint="default"/>
         <w:sz w:val="20"/>
       </w:rPr>
     </w:lvl>
@@ -4197,7 +4197,7 @@
         <w:ind w:left="5040" w:hanging="360"/>
       </w:pPr>
       <w:rPr>
-        <w:rFonts w:ascii="Wingdings" w:hAnsi="Wingdings" w:hint="default"/>
+        <w:rFonts w:ascii="Montserrat" w:hAnsi="Montserrat" w:hint="default"/>
         <w:sz w:val="20"/>
       </w:rPr>
     </w:lvl>
@@ -4213,7 +4213,7 @@
         <w:ind w:left="5760" w:hanging="360"/>
       </w:pPr>
       <w:rPr>
-        <w:rFonts w:ascii="Wingdings" w:hAnsi="Wingdings" w:hint="default"/>
+        <w:rFonts w:ascii="Montserrat" w:hAnsi="Montserrat" w:hint="default"/>
         <w:sz w:val="20"/>
       </w:rPr>
     </w:lvl>
@@ -4229,7 +4229,7 @@
         <w:ind w:left="6480" w:hanging="360"/>
       </w:pPr>
       <w:rPr>
-        <w:rFonts w:ascii="Wingdings" w:hAnsi="Wingdings" w:hint="default"/>
+        <w:rFonts w:ascii="Montserrat" w:hAnsi="Montserrat" w:hint="default"/>
         <w:sz w:val="20"/>
       </w:rPr>
     </w:lvl>
@@ -4247,7 +4247,7 @@
         <w:ind w:left="720" w:hanging="360"/>
       </w:pPr>
       <w:rPr>
-        <w:rFonts w:ascii="Symbol" w:hAnsi="Symbol" w:hint="default"/>
+        <w:rFonts w:ascii="Montserrat" w:hAnsi="Montserrat" w:hint="default"/>
       </w:rPr>
     </w:lvl>
     <w:lvl w:ilvl="1" w:tplc="04090003" w:tentative="1">
@@ -4259,7 +4259,7 @@
         <w:ind w:left="1440" w:hanging="360"/>
       </w:pPr>
       <w:rPr>
-        <w:rFonts w:ascii="Courier New" w:hAnsi="Courier New" w:cs="Courier New" w:hint="default"/>
+        <w:rFonts w:ascii="Montserrat" w:hAnsi="Montserrat" w:cs="Readex Pro Light" w:hint="default"/>
       </w:rPr>
     </w:lvl>
     <w:lvl w:ilvl="2" w:tplc="04090005" w:tentative="1">
@@ -4271,7 +4271,7 @@
         <w:ind w:left="2160" w:hanging="360"/>
       </w:pPr>
       <w:rPr>
-        <w:rFonts w:ascii="Wingdings" w:hAnsi="Wingdings" w:hint="default"/>
+        <w:rFonts w:ascii="Montserrat" w:hAnsi="Montserrat" w:hint="default"/>
       </w:rPr>
     </w:lvl>
     <w:lvl w:ilvl="3" w:tplc="04090001" w:tentative="1">
@@ -4283,7 +4283,7 @@
         <w:ind w:left="2880" w:hanging="360"/>
       </w:pPr>
       <w:rPr>
-        <w:rFonts w:ascii="Symbol" w:hAnsi="Symbol" w:hint="default"/>
+        <w:rFonts w:ascii="Montserrat" w:hAnsi="Montserrat" w:hint="default"/>
       </w:rPr>
     </w:lvl>
     <w:lvl w:ilvl="4" w:tplc="04090003" w:tentative="1">
@@ -4295,7 +4295,7 @@
         <w:ind w:left="3600" w:hanging="360"/>
       </w:pPr>
       <w:rPr>
-        <w:rFonts w:ascii="Courier New" w:hAnsi="Courier New" w:cs="Courier New" w:hint="default"/>
+        <w:rFonts w:ascii="Montserrat" w:hAnsi="Montserrat" w:cs="Readex Pro Light" w:hint="default"/>
       </w:rPr>
     </w:lvl>
     <w:lvl w:ilvl="5" w:tplc="04090005" w:tentative="1">
@@ -4307,7 +4307,7 @@
         <w:ind w:left="4320" w:hanging="360"/>
       </w:pPr>
       <w:rPr>
-        <w:rFonts w:ascii="Wingdings" w:hAnsi="Wingdings" w:hint="default"/>
+        <w:rFonts w:ascii="Montserrat" w:hAnsi="Montserrat" w:hint="default"/>
       </w:rPr>
     </w:lvl>
     <w:lvl w:ilvl="6" w:tplc="04090001" w:tentative="1">
@@ -4319,7 +4319,7 @@
         <w:ind w:left="5040" w:hanging="360"/>
       </w:pPr>
       <w:rPr>
-        <w:rFonts w:ascii="Symbol" w:hAnsi="Symbol" w:hint="default"/>
+        <w:rFonts w:ascii="Montserrat" w:hAnsi="Montserrat" w:hint="default"/>
       </w:rPr>
     </w:lvl>
     <w:lvl w:ilvl="7" w:tplc="04090003" w:tentative="1">
@@ -4331,7 +4331,7 @@
         <w:ind w:left="5760" w:hanging="360"/>
       </w:pPr>
       <w:rPr>
-        <w:rFonts w:ascii="Courier New" w:hAnsi="Courier New" w:cs="Courier New" w:hint="default"/>
+        <w:rFonts w:ascii="Montserrat" w:hAnsi="Montserrat" w:cs="Readex Pro Light" w:hint="default"/>
       </w:rPr>
     </w:lvl>
     <w:lvl w:ilvl="8" w:tplc="04090005" w:tentative="1">
@@ -4343,7 +4343,7 @@
         <w:ind w:left="6480" w:hanging="360"/>
       </w:pPr>
       <w:rPr>
-        <w:rFonts w:ascii="Wingdings" w:hAnsi="Wingdings" w:hint="default"/>
+        <w:rFonts w:ascii="Montserrat" w:hAnsi="Montserrat" w:hint="default"/>
       </w:rPr>
     </w:lvl>
   </w:abstractNum>
@@ -4770,7 +4770,7 @@
         <w:ind w:left="720" w:hanging="360"/>
       </w:pPr>
       <w:rPr>
-        <w:rFonts w:ascii="Symbol" w:hAnsi="Symbol" w:hint="default"/>
+        <w:rFonts w:ascii="Montserrat" w:hAnsi="Montserrat" w:hint="default"/>
         <w:sz w:val="20"/>
       </w:rPr>
     </w:lvl>
@@ -4786,7 +4786,7 @@
         <w:ind w:left="1440" w:hanging="360"/>
       </w:pPr>
       <w:rPr>
-        <w:rFonts w:ascii="Courier New" w:hAnsi="Courier New" w:hint="default"/>
+        <w:rFonts w:ascii="Montserrat" w:hAnsi="Montserrat" w:hint="default"/>
         <w:sz w:val="20"/>
       </w:rPr>
     </w:lvl>
@@ -4802,7 +4802,7 @@
         <w:ind w:left="2160" w:hanging="360"/>
       </w:pPr>
       <w:rPr>
-        <w:rFonts w:ascii="Wingdings" w:hAnsi="Wingdings" w:hint="default"/>
+        <w:rFonts w:ascii="Montserrat" w:hAnsi="Montserrat" w:hint="default"/>
         <w:sz w:val="20"/>
       </w:rPr>
     </w:lvl>
@@ -4818,7 +4818,7 @@
         <w:ind w:left="2880" w:hanging="360"/>
       </w:pPr>
       <w:rPr>
-        <w:rFonts w:ascii="Wingdings" w:hAnsi="Wingdings" w:hint="default"/>
+        <w:rFonts w:ascii="Montserrat" w:hAnsi="Montserrat" w:hint="default"/>
         <w:sz w:val="20"/>
       </w:rPr>
     </w:lvl>
@@ -4834,7 +4834,7 @@
         <w:ind w:left="3600" w:hanging="360"/>
       </w:pPr>
       <w:rPr>
-        <w:rFonts w:ascii="Wingdings" w:hAnsi="Wingdings" w:hint="default"/>
+        <w:rFonts w:ascii="Montserrat" w:hAnsi="Montserrat" w:hint="default"/>
         <w:sz w:val="20"/>
       </w:rPr>
     </w:lvl>
@@ -4850,7 +4850,7 @@
         <w:ind w:left="4320" w:hanging="360"/>
       </w:pPr>
       <w:rPr>
-        <w:rFonts w:ascii="Wingdings" w:hAnsi="Wingdings" w:hint="default"/>
+        <w:rFonts w:ascii="Montserrat" w:hAnsi="Montserrat" w:hint="default"/>
         <w:sz w:val="20"/>
       </w:rPr>
     </w:lvl>
@@ -4866,7 +4866,7 @@
         <w:ind w:left="5040" w:hanging="360"/>
       </w:pPr>
       <w:rPr>
-        <w:rFonts w:ascii="Wingdings" w:hAnsi="Wingdings" w:hint="default"/>
+        <w:rFonts w:ascii="Montserrat" w:hAnsi="Montserrat" w:hint="default"/>
         <w:sz w:val="20"/>
       </w:rPr>
     </w:lvl>
@@ -4882,7 +4882,7 @@
         <w:ind w:left="5760" w:hanging="360"/>
       </w:pPr>
       <w:rPr>
-        <w:rFonts w:ascii="Wingdings" w:hAnsi="Wingdings" w:hint="default"/>
+        <w:rFonts w:ascii="Montserrat" w:hAnsi="Montserrat" w:hint="default"/>
         <w:sz w:val="20"/>
       </w:rPr>
     </w:lvl>
@@ -4898,7 +4898,7 @@
         <w:ind w:left="6480" w:hanging="360"/>
       </w:pPr>
       <w:rPr>
-        <w:rFonts w:ascii="Wingdings" w:hAnsi="Wingdings" w:hint="default"/>
+        <w:rFonts w:ascii="Montserrat" w:hAnsi="Montserrat" w:hint="default"/>
         <w:sz w:val="20"/>
       </w:rPr>
     </w:lvl>
@@ -4916,7 +4916,7 @@
         <w:ind w:left="720" w:hanging="360"/>
       </w:pPr>
       <w:rPr>
-        <w:rFonts w:ascii="Symbol" w:hAnsi="Symbol" w:hint="default"/>
+        <w:rFonts w:ascii="Montserrat" w:hAnsi="Montserrat" w:hint="default"/>
       </w:rPr>
     </w:lvl>
     <w:lvl w:ilvl="1" w:tplc="04090003" w:tentative="1">
@@ -4928,7 +4928,7 @@
         <w:ind w:left="1440" w:hanging="360"/>
       </w:pPr>
       <w:rPr>
-        <w:rFonts w:ascii="Courier New" w:hAnsi="Courier New" w:cs="Courier New" w:hint="default"/>
+        <w:rFonts w:ascii="Montserrat" w:hAnsi="Montserrat" w:cs="Readex Pro Light" w:hint="default"/>
       </w:rPr>
     </w:lvl>
     <w:lvl w:ilvl="2" w:tplc="04090005" w:tentative="1">
@@ -4940,7 +4940,7 @@
         <w:ind w:left="2160" w:hanging="360"/>
       </w:pPr>
       <w:rPr>
-        <w:rFonts w:ascii="Wingdings" w:hAnsi="Wingdings" w:hint="default"/>
+        <w:rFonts w:ascii="Montserrat" w:hAnsi="Montserrat" w:hint="default"/>
       </w:rPr>
     </w:lvl>
     <w:lvl w:ilvl="3" w:tplc="04090001" w:tentative="1">
@@ -4952,7 +4952,7 @@
         <w:ind w:left="2880" w:hanging="360"/>
       </w:pPr>
       <w:rPr>
-        <w:rFonts w:ascii="Symbol" w:hAnsi="Symbol" w:hint="default"/>
+        <w:rFonts w:ascii="Montserrat" w:hAnsi="Montserrat" w:hint="default"/>
       </w:rPr>
     </w:lvl>
     <w:lvl w:ilvl="4" w:tplc="04090003" w:tentative="1">
@@ -4964,7 +4964,7 @@
         <w:ind w:left="3600" w:hanging="360"/>
       </w:pPr>
       <w:rPr>
-        <w:rFonts w:ascii="Courier New" w:hAnsi="Courier New" w:cs="Courier New" w:hint="default"/>
+        <w:rFonts w:ascii="Montserrat" w:hAnsi="Montserrat" w:cs="Readex Pro Light" w:hint="default"/>
       </w:rPr>
     </w:lvl>
     <w:lvl w:ilvl="5" w:tplc="04090005" w:tentative="1">
@@ -4976,7 +4976,7 @@
         <w:ind w:left="4320" w:hanging="360"/>
       </w:pPr>
       <w:rPr>
-        <w:rFonts w:ascii="Wingdings" w:hAnsi="Wingdings" w:hint="default"/>
+        <w:rFonts w:ascii="Montserrat" w:hAnsi="Montserrat" w:hint="default"/>
       </w:rPr>
     </w:lvl>
     <w:lvl w:ilvl="6" w:tplc="04090001" w:tentative="1">
@@ -4988,7 +4988,7 @@
         <w:ind w:left="5040" w:hanging="360"/>
       </w:pPr>
       <w:rPr>
-        <w:rFonts w:ascii="Symbol" w:hAnsi="Symbol" w:hint="default"/>
+        <w:rFonts w:ascii="Montserrat" w:hAnsi="Montserrat" w:hint="default"/>
       </w:rPr>
     </w:lvl>
     <w:lvl w:ilvl="7" w:tplc="04090003" w:tentative="1">
@@ -5000,7 +5000,7 @@
         <w:ind w:left="5760" w:hanging="360"/>
       </w:pPr>
       <w:rPr>
-        <w:rFonts w:ascii="Courier New" w:hAnsi="Courier New" w:cs="Courier New" w:hint="default"/>
+        <w:rFonts w:ascii="Montserrat" w:hAnsi="Montserrat" w:cs="Readex Pro Light" w:hint="default"/>
       </w:rPr>
     </w:lvl>
     <w:lvl w:ilvl="8" w:tplc="04090005" w:tentative="1">
@@ -5012,7 +5012,7 @@
         <w:ind w:left="6480" w:hanging="360"/>
       </w:pPr>
       <w:rPr>
-        <w:rFonts w:ascii="Wingdings" w:hAnsi="Wingdings" w:hint="default"/>
+        <w:rFonts w:ascii="Montserrat" w:hAnsi="Montserrat" w:hint="default"/>
       </w:rPr>
     </w:lvl>
   </w:abstractNum>
@@ -5032,7 +5032,7 @@
         <w:ind w:left="720" w:hanging="360"/>
       </w:pPr>
       <w:rPr>
-        <w:rFonts w:ascii="Symbol" w:hAnsi="Symbol" w:hint="default"/>
+        <w:rFonts w:ascii="Montserrat" w:hAnsi="Montserrat" w:hint="default"/>
         <w:sz w:val="20"/>
       </w:rPr>
     </w:lvl>
@@ -5048,7 +5048,7 @@
         <w:ind w:left="1440" w:hanging="360"/>
       </w:pPr>
       <w:rPr>
-        <w:rFonts w:ascii="Courier New" w:hAnsi="Courier New" w:hint="default"/>
+        <w:rFonts w:ascii="Montserrat" w:hAnsi="Montserrat" w:hint="default"/>
         <w:sz w:val="20"/>
       </w:rPr>
     </w:lvl>
@@ -5064,7 +5064,7 @@
         <w:ind w:left="2160" w:hanging="360"/>
       </w:pPr>
       <w:rPr>
-        <w:rFonts w:ascii="Wingdings" w:hAnsi="Wingdings" w:hint="default"/>
+        <w:rFonts w:ascii="Montserrat" w:hAnsi="Montserrat" w:hint="default"/>
         <w:sz w:val="20"/>
       </w:rPr>
     </w:lvl>
@@ -5080,7 +5080,7 @@
         <w:ind w:left="2880" w:hanging="360"/>
       </w:pPr>
       <w:rPr>
-        <w:rFonts w:ascii="Wingdings" w:hAnsi="Wingdings" w:hint="default"/>
+        <w:rFonts w:ascii="Montserrat" w:hAnsi="Montserrat" w:hint="default"/>
         <w:sz w:val="20"/>
       </w:rPr>
     </w:lvl>
@@ -5096,7 +5096,7 @@
         <w:ind w:left="3600" w:hanging="360"/>
       </w:pPr>
       <w:rPr>
-        <w:rFonts w:ascii="Wingdings" w:hAnsi="Wingdings" w:hint="default"/>
+        <w:rFonts w:ascii="Montserrat" w:hAnsi="Montserrat" w:hint="default"/>
         <w:sz w:val="20"/>
       </w:rPr>
     </w:lvl>
@@ -5112,7 +5112,7 @@
         <w:ind w:left="4320" w:hanging="360"/>
       </w:pPr>
       <w:rPr>
-        <w:rFonts w:ascii="Wingdings" w:hAnsi="Wingdings" w:hint="default"/>
+        <w:rFonts w:ascii="Montserrat" w:hAnsi="Montserrat" w:hint="default"/>
         <w:sz w:val="20"/>
       </w:rPr>
     </w:lvl>
@@ -5128,7 +5128,7 @@
         <w:ind w:left="5040" w:hanging="360"/>
       </w:pPr>
       <w:rPr>
-        <w:rFonts w:ascii="Wingdings" w:hAnsi="Wingdings" w:hint="default"/>
+        <w:rFonts w:ascii="Montserrat" w:hAnsi="Montserrat" w:hint="default"/>
         <w:sz w:val="20"/>
       </w:rPr>
     </w:lvl>
@@ -5144,7 +5144,7 @@
         <w:ind w:left="5760" w:hanging="360"/>
       </w:pPr>
       <w:rPr>
-        <w:rFonts w:ascii="Wingdings" w:hAnsi="Wingdings" w:hint="default"/>
+        <w:rFonts w:ascii="Montserrat" w:hAnsi="Montserrat" w:hint="default"/>
         <w:sz w:val="20"/>
       </w:rPr>
     </w:lvl>
@@ -5160,7 +5160,7 @@
         <w:ind w:left="6480" w:hanging="360"/>
       </w:pPr>
       <w:rPr>
-        <w:rFonts w:ascii="Wingdings" w:hAnsi="Wingdings" w:hint="default"/>
+        <w:rFonts w:ascii="Montserrat" w:hAnsi="Montserrat" w:hint="default"/>
         <w:sz w:val="20"/>
       </w:rPr>
     </w:lvl>
@@ -5702,7 +5702,7 @@
       <w:spacing w:after="0" w:line="240" w:lineRule="auto"/>
     </w:pPr>
     <w:rPr>
-      <w:rFonts w:ascii="Montserrat" w:eastAsiaTheme="minorHAnsi" w:hAnsi="Montserrat" w:cs="Noto Kufi Arabic"/>
+      <w:rFonts w:ascii="Montserrat" w:eastAsiaTheme="minorHAnsi" w:hAnsi="Montserrat" w:cs="Readex Pro Light"/>
       <w:kern w:val="0"/>
       <w:sz w:val="14"/>
       <w:szCs w:val="14"/>
@@ -5724,7 +5724,7 @@
       <w:outlineLvl w:val="0"/>
     </w:pPr>
     <w:rPr>
-      <w:rFonts w:ascii="Montserrat" w:hAnsi="Montserrat" w:cs="Arial"/>
+      <w:rFonts w:ascii="Montserrat" w:hAnsi="Montserrat" w:cs="Readex Pro Light"/>
       <w:b/>
       <w:bCs/>
       <w:color w:val="561B2F" w:themeColor="accent1"/>
@@ -5747,7 +5747,7 @@
       <w:outlineLvl w:val="1"/>
     </w:pPr>
     <w:rPr>
-      <w:rFonts w:ascii="Montserrat" w:hAnsi="Montserrat" w:cs="Arial"/>
+      <w:rFonts w:ascii="Montserrat" w:hAnsi="Montserrat" w:cs="Readex Pro Light"/>
       <w:b/>
       <w:bCs/>
       <w:color w:val="561B2F" w:themeColor="accent1"/>
@@ -5770,7 +5770,7 @@
       <w:outlineLvl w:val="2"/>
     </w:pPr>
     <w:rPr>
-      <w:rFonts w:ascii="Montserrat" w:hAnsi="Montserrat" w:cs="Arial"/>
+      <w:rFonts w:ascii="Montserrat" w:hAnsi="Montserrat" w:cs="Readex Pro Light"/>
       <w:b/>
       <w:bCs/>
       <w:color w:val="561B2F" w:themeColor="accent1"/>
@@ -5793,7 +5793,7 @@
       <w:outlineLvl w:val="3"/>
     </w:pPr>
     <w:rPr>
-      <w:rFonts w:ascii="Montserrat" w:hAnsi="Montserrat" w:cs="Arial"/>
+      <w:rFonts w:ascii="Montserrat" w:hAnsi="Montserrat" w:cs="Readex Pro Light"/>
       <w:i/>
       <w:iCs/>
       <w:color w:val="561B2F"/>
@@ -5952,7 +5952,7 @@
       <w:jc w:val="center"/>
     </w:pPr>
     <w:rPr>
-      <w:rFonts w:ascii="Yu Gothic" w:hAnsi="Yu Gothic"/>
+      <w:rFonts w:ascii="Montserrat" w:hAnsi="Montserrat"/>
       <w:b w:val="0"/>
       <w:color w:val="8B0101"/>
       <w:szCs w:val="24"/>
@@ -5966,7 +5966,7 @@
     <w:uiPriority w:val="9"/>
     <w:rsid w:val="00CD7781"/>
     <w:rPr>
-      <w:rFonts w:ascii="Montserrat" w:hAnsi="Montserrat" w:cs="Arial"/>
+      <w:rFonts w:ascii="Montserrat" w:hAnsi="Montserrat" w:cs="Readex Pro Light"/>
       <w:b/>
       <w:bCs/>
       <w:color w:val="561B2F" w:themeColor="accent1"/>
@@ -5987,7 +5987,7 @@
       <w:jc w:val="center"/>
     </w:pPr>
     <w:rPr>
-      <w:rFonts w:ascii="Yu Gothic" w:hAnsi="Yu Gothic" w:cs="Open Sans"/>
+      <w:rFonts w:ascii="Montserrat" w:hAnsi="Montserrat" w:cs="Readex Pro Light"/>
       <w:b w:val="0"/>
       <w:color w:val="8B0101"/>
       <w:szCs w:val="20"/>
@@ -5999,7 +5999,7 @@
     <w:link w:val="YuGothic3"/>
     <w:rsid w:val="008120F4"/>
     <w:rPr>
-      <w:rFonts w:ascii="Yu Gothic" w:eastAsiaTheme="majorEastAsia" w:hAnsi="Yu Gothic" w:cs="Open Sans"/>
+      <w:rFonts w:ascii="Montserrat" w:eastAsiaTheme="majorEastAsia" w:hAnsi="Montserrat" w:cs="Readex Pro Light"/>
       <w:b w:val="0"/>
       <w:bCs/>
       <w:color w:val="8B0101"/>
@@ -6023,7 +6023,7 @@
       <w:ind w:hanging="360"/>
     </w:pPr>
     <w:rPr>
-      <w:rFonts w:ascii="Yu Gothic" w:hAnsi="Yu Gothic"/>
+      <w:rFonts w:ascii="Montserrat" w:hAnsi="Montserrat"/>
       <w:b w:val="0"/>
       <w:color w:val="8B0101"/>
       <w:sz w:val="18"/>
@@ -6037,7 +6037,7 @@
     <w:link w:val="YuGothic2"/>
     <w:rsid w:val="008120F4"/>
     <w:rPr>
-      <w:rFonts w:ascii="Yu Gothic" w:eastAsiaTheme="majorEastAsia" w:hAnsi="Yu Gothic" w:cstheme="majorBidi"/>
+      <w:rFonts w:ascii="Montserrat" w:eastAsiaTheme="majorEastAsia" w:hAnsi="Montserrat" w:cstheme="majorBidi"/>
       <w:b w:val="0"/>
       <w:bCs/>
       <w:color w:val="8B0101"/>
@@ -6055,7 +6055,7 @@
     <w:uiPriority w:val="9"/>
     <w:rsid w:val="00CD7781"/>
     <w:rPr>
-      <w:rFonts w:ascii="Montserrat" w:hAnsi="Montserrat" w:cs="Arial"/>
+      <w:rFonts w:ascii="Montserrat" w:hAnsi="Montserrat" w:cs="Readex Pro Light"/>
       <w:b/>
       <w:bCs/>
       <w:color w:val="561B2F" w:themeColor="accent1"/>
@@ -6086,7 +6086,7 @@
     <w:uiPriority w:val="9"/>
     <w:rsid w:val="00F313A5"/>
     <w:rPr>
-      <w:rFonts w:ascii="Montserrat" w:eastAsia="Arial" w:hAnsi="Montserrat" w:cs="Arial"/>
+      <w:rFonts w:ascii="Montserrat" w:eastAsia="Arial" w:hAnsi="Montserrat" w:cs="Readex Pro Light"/>
       <w:i/>
       <w:iCs/>
       <w:color w:val="561B2F"/>
@@ -6103,7 +6103,7 @@
     <w:uiPriority w:val="9"/>
     <w:rsid w:val="00CD7781"/>
     <w:rPr>
-      <w:rFonts w:ascii="Montserrat" w:hAnsi="Montserrat" w:cs="Arial"/>
+      <w:rFonts w:ascii="Montserrat" w:hAnsi="Montserrat" w:cs="Readex Pro Light"/>
       <w:b/>
       <w:bCs/>
       <w:color w:val="561B2F" w:themeColor="accent1"/>
@@ -6122,7 +6122,7 @@
       <w:spacing w:after="0" w:line="240" w:lineRule="auto"/>
     </w:pPr>
     <w:rPr>
-      <w:rFonts w:ascii="Arial" w:hAnsi="Arial" w:cs="Arial"/>
+      <w:rFonts w:ascii="Montserrat" w:hAnsi="Montserrat" w:cs="Readex Pro Light"/>
       <w:kern w:val="0"/>
       <w:sz w:val="20"/>
       <w:szCs w:val="20"/>
@@ -6182,7 +6182,7 @@
       <w:spacing w:after="0" w:line="240" w:lineRule="auto"/>
     </w:pPr>
     <w:rPr>
-      <w:rFonts w:ascii="Montserrat" w:hAnsi="Montserrat" w:cs="Arial"/>
+      <w:rFonts w:ascii="Montserrat" w:hAnsi="Montserrat" w:cs="Readex Pro Light"/>
       <w:kern w:val="0"/>
       <w:sz w:val="20"/>
       <w:szCs w:val="20"/>
@@ -6219,7 +6219,7 @@
       <w:spacing w:after="0" w:line="240" w:lineRule="auto"/>
     </w:pPr>
     <w:rPr>
-      <w:rFonts w:ascii="Montserrat" w:hAnsi="Montserrat" w:cs="Arial"/>
+      <w:rFonts w:ascii="Montserrat" w:hAnsi="Montserrat" w:cs="Readex Pro Light"/>
       <w:kern w:val="0"/>
       <w:sz w:val="20"/>
       <w:szCs w:val="20"/>
@@ -6457,7 +6457,7 @@
     <w:uiPriority w:val="29"/>
     <w:rsid w:val="001045A1"/>
     <w:rPr>
-      <w:rFonts w:ascii="Montserrat" w:hAnsi="Montserrat" w:cs="Arial"/>
+      <w:rFonts w:ascii="Montserrat" w:hAnsi="Montserrat" w:cs="Readex Pro Light"/>
       <w:i/>
       <w:iCs/>
       <w:color w:val="404040" w:themeColor="text1" w:themeTint="BF"/>
@@ -6509,7 +6509,7 @@
     <w:uiPriority w:val="30"/>
     <w:rsid w:val="001045A1"/>
     <w:rPr>
-      <w:rFonts w:ascii="Montserrat" w:hAnsi="Montserrat" w:cs="Arial"/>
+      <w:rFonts w:ascii="Montserrat" w:hAnsi="Montserrat" w:cs="Readex Pro Light"/>
       <w:i/>
       <w:iCs/>
       <w:color w:val="401423" w:themeColor="accent1" w:themeShade="BF"/>
@@ -6556,7 +6556,7 @@
     <w:uiPriority w:val="99"/>
     <w:rsid w:val="001045A1"/>
     <w:rPr>
-      <w:rFonts w:ascii="Montserrat" w:hAnsi="Montserrat" w:cs="Arial"/>
+      <w:rFonts w:ascii="Montserrat" w:hAnsi="Montserrat" w:cs="Readex Pro Light"/>
       <w:kern w:val="0"/>
       <w:sz w:val="20"/>
       <w:szCs w:val="20"/>
@@ -6584,7 +6584,7 @@
     <w:uiPriority w:val="99"/>
     <w:rsid w:val="001045A1"/>
     <w:rPr>
-      <w:rFonts w:ascii="Montserrat" w:hAnsi="Montserrat" w:cs="Arial"/>
+      <w:rFonts w:ascii="Montserrat" w:hAnsi="Montserrat" w:cs="Readex Pro Light"/>
       <w:kern w:val="0"/>
       <w:sz w:val="20"/>
       <w:szCs w:val="20"/>
@@ -6753,7 +6753,7 @@
       <w:spacing w:after="0" w:line="240" w:lineRule="auto"/>
     </w:pPr>
     <w:rPr>
-      <w:rFonts w:ascii="Arial" w:hAnsi="Arial" w:cs="Arial"/>
+      <w:rFonts w:ascii="Montserrat" w:hAnsi="Montserrat" w:cs="Readex Pro Light"/>
       <w:color w:val="000000"/>
       <w:kern w:val="0"/>
       <w:sz w:val="18"/>
@@ -6776,7 +6776,7 @@
     <w:basedOn w:val="Normal"/>
     <w:rsid w:val="00C97791"/>
     <w:rPr>
-      <w:rFonts w:ascii="Arial" w:hAnsi="Arial" w:cs="Arial"/>
+      <w:rFonts w:ascii="Montserrat" w:hAnsi="Montserrat" w:cs="Readex Pro Light"/>
       <w:sz w:val="28"/>
       <w:lang w:val="en-AU"/>
     </w:rPr>
@@ -6846,7 +6846,7 @@
       <w:spacing w:before="100" w:beforeAutospacing="1" w:after="100" w:afterAutospacing="1"/>
     </w:pPr>
     <w:rPr>
-      <w:rFonts w:ascii="Times New Roman" w:eastAsia="Times New Roman" w:hAnsi="Times New Roman" w:cs="Times New Roman"/>
+      <w:rFonts w:ascii="Montserrat" w:eastAsia="Times New Roman" w:hAnsi="Montserrat" w:cs="Readex Pro Light"/>
       <w:sz w:val="24"/>
       <w:szCs w:val="24"/>
     </w:rPr>
@@ -6897,9 +6897,9 @@
     </a:clrScheme>
     <a:fontScheme name="Office">
       <a:majorFont>
-        <a:latin typeface="Aptos Display" panose="02110004020202020204"/>
+        <a:latin typeface="Montserrat" panose="02110004020202020204"/>
         <a:ea typeface=""/>
-        <a:cs typeface=""/>
+        <a:cs typeface="Readex Pro Light"/>
         <a:font script="Jpan" typeface="游ゴシック Light"/>
         <a:font script="Hang" typeface="맑은 고딕"/>
         <a:font script="Hans" typeface="等线 Light"/>
@@ -6949,9 +6949,9 @@
         <a:font script="Tfng" typeface="Ebrima"/>
       </a:majorFont>
       <a:minorFont>
-        <a:latin typeface="Aptos" panose="02110004020202020204"/>
+        <a:latin typeface="Montserrat" panose="02110004020202020204"/>
         <a:ea typeface=""/>
-        <a:cs typeface=""/>
+        <a:cs typeface="Readex Pro Light"/>
         <a:font script="Jpan" typeface="游明朝"/>
         <a:font script="Hang" typeface="맑은 고딕"/>
         <a:font script="Hans" typeface="等线"/>

</xml_diff>